<commit_message>
week2: threading vs multiprocessing (variant 5) + repo link in both reports
- Week 2 (эффект GIL, вариант 5, n_tasks=4 cpu_n=280000 io_sleep=0.40с):
  starter.py (unchanged), solution.py (реализация run_with_threads /
  run_with_processes + 2×3×2 benchmark-харнесс), plot_speedup.py.
  results/: bench.json (сырые замеры), bench_stdout.txt, speedup.png.
- Ключевой результат при 4 воркерах: threads/CPU 1.00× (GIL),
  processes/CPU 3.43×, threads/IO 4.01×, processes/IO 3.35×.
- REPORT.md + docx-form по шаблону преподавателя.
- Оба отчёта (week1 и week2) теперь содержат ссылку на репозиторий
  как отдельную строку в metadata-таблице — чтобы файла отчёта
  было достаточно для сдачи в Moodle.
</commit_message>
<xml_diff>
--- a/week1/Отчёт_Лабораторная_1_вариант5.docx
+++ b/week1/Отчёт_Лабораторная_1_вариант5.docx
@@ -381,6 +381,51 @@
             </w:pPr>
             <w:r>
               <w:t>2026-09-15</w:t>
+            </w:r>
+          </w:p>
+        </w:tc>
+      </w:tr>
+      <w:tr>
+        <w:tc>
+          <w:tcPr>
+            <w:tcW w:type="dxa" w:w="3200"/>
+            <w:tcMar>
+              <w:top w:type="dxa" w:w="70"/>
+              <w:left w:type="dxa" w:w="90"/>
+              <w:bottom w:type="dxa" w:w="70"/>
+              <w:right w:type="dxa" w:w="90"/>
+            </w:tcMar>
+            <w:vAlign w:val="center"/>
+          </w:tcPr>
+          <w:p>
+            <w:pPr>
+              <w:spacing w:after="0"/>
+            </w:pPr>
+            <w:r>
+              <w:t>Репозиторий</w:t>
+            </w:r>
+          </w:p>
+        </w:tc>
+        <w:tc>
+          <w:tcPr>
+            <w:tcW w:type="dxa" w:w="5800"/>
+            <w:tcMar>
+              <w:top w:type="dxa" w:w="70"/>
+              <w:left w:type="dxa" w:w="90"/>
+              <w:bottom w:type="dxa" w:w="70"/>
+              <w:right w:type="dxa" w:w="90"/>
+            </w:tcMar>
+            <w:vAlign w:val="center"/>
+          </w:tcPr>
+          <w:p>
+            <w:pPr>
+              <w:spacing w:after="0"/>
+            </w:pPr>
+            <w:r>
+              <w:rPr>
+                <w:b/>
+              </w:rPr>
+              <w:t>https://github.com/Yerassyl20036/parallel_computing_fall_2026</w:t>
             </w:r>
           </w:p>
         </w:tc>

</xml_diff>